<commit_message>
Q1 benchmark results + report update
- benchmark_q1.py: add --pipeline multi mode simulating sem_map → sem_filter
  chain; shows OPERATOR granularity achieves 0% over-routing vs 53% for
  FIELD/DOCUMENT on 1,000 records
- draft.md: add Section 3.4 with Q1 results table and FIELD vs DOCUMENT
  explanation; update timeline and Denis contributions
- midterm_report.docx: regenerated from updated draft
- format_resumes.py: add watermark stripping to fix 2 data pipeline artifacts
- data/q1_*.json: benchmark result files

Co-Authored-By: Claude Sonnet 4.6 <noreply@anthropic.com>
</commit_message>
<xml_diff>
--- a/midterm_report.docx
+++ b/midterm_report.docx
@@ -2,7 +2,7 @@
 <file path=word/document.xml><?xml version="1.0" encoding="utf-8"?>
 <w:document xmlns:w="http://schemas.openxmlformats.org/wordprocessingml/2006/main" xmlns:m="http://schemas.openxmlformats.org/officeDocument/2006/math" xmlns:r="http://schemas.openxmlformats.org/officeDocument/2006/relationships" xmlns:o="urn:schemas-microsoft-com:office:office" xmlns:v="urn:schemas-microsoft-com:vml" xmlns:w10="urn:schemas-microsoft-com:office:word" xmlns:a="http://schemas.openxmlformats.org/drawingml/2006/main" xmlns:pic="http://schemas.openxmlformats.org/drawingml/2006/picture" xmlns:wp="http://schemas.openxmlformats.org/drawingml/2006/wordprocessingDrawing">
   <w:body>
-    <w:bookmarkStart w:id="23" w:name="mid-term-project-report"/>
+    <w:bookmarkStart w:id="24" w:name="mid-term-project-report"/>
     <w:p>
       <w:pPr>
         <w:pStyle w:val="Heading1"/>
@@ -872,7 +872,7 @@
     </w:p>
     <w:bookmarkEnd w:id="13"/>
     <w:bookmarkEnd w:id="14"/>
-    <w:bookmarkStart w:id="18" w:name="results-to-date"/>
+    <w:bookmarkStart w:id="19" w:name="results-to-date"/>
     <w:p>
       <w:pPr>
         <w:pStyle w:val="Heading2"/>
@@ -2231,22 +2231,22 @@
         <w:t xml:space="preserve">GPT-4o-mini provides the reference quality ceiling for the routing benchmark. The routing system will aim to match this on non-PII records (by routing them to cloud) while keeping sensitive records local, accepting the quality gap on locally-routed records as the privacy cost.</w:t>
       </w:r>
     </w:p>
-    <w:p>
-      <w:r>
-        <w:pict>
-          <v:rect style="width:0;height:1.5pt" o:hralign="center" o:hrstd="t" o:hr="t"/>
-        </w:pict>
-      </w:r>
-    </w:p>
     <w:bookmarkEnd w:id="17"/>
-    <w:bookmarkEnd w:id="18"/>
-    <w:bookmarkStart w:id="19" w:name="potential-problems-and-mitigations"/>
-    <w:p>
-      <w:pPr>
-        <w:pStyle w:val="Heading2"/>
-      </w:pPr>
-      <w:r>
-        <w:t xml:space="preserve">4. Potential Problems and Mitigations</w:t>
+    <w:bookmarkStart w:id="18" w:name="X81eae81425498e73bd3ac3608898550a2a7bfe8"/>
+    <w:p>
+      <w:pPr>
+        <w:pStyle w:val="Heading3"/>
+      </w:pPr>
+      <w:r>
+        <w:t xml:space="preserve">3.4 Q1 — Routing Granularity Benchmark (1,000 records, dry-run)</w:t>
+      </w:r>
+    </w:p>
+    <w:p>
+      <w:pPr>
+        <w:pStyle w:val="FirstParagraph"/>
+      </w:pPr>
+      <w:r>
+        <w:t xml:space="preserve">To answer Q1 we simulated a two-operator pipeline on 1,000 stratified records (250 per PII group) using Presidio/regex routing with no LLM calls:</w:t>
       </w:r>
     </w:p>
     <w:p>
@@ -2262,28 +2262,46 @@
           <w:b/>
           <w:bCs/>
         </w:rPr>
-        <w:t xml:space="preserve">Local model quality gap is empirically confirmed.</w:t>
-      </w:r>
-      <w:r>
-        <w:t xml:space="preserve"> </w:t>
-      </w:r>
-      <w:r>
-        <w:t xml:space="preserve">llama3.2 recall on</w:t>
-      </w:r>
-      <w:r>
-        <w:t xml:space="preserve"> </w:t>
-      </w:r>
-      <w:r>
-        <w:rPr>
-          <w:rStyle w:val="VerbatimChar"/>
-        </w:rPr>
-        <w:t xml:space="preserve">sem_filter</w:t>
-      </w:r>
-      <w:r>
-        <w:t xml:space="preserve"> </w:t>
-      </w:r>
-      <w:r>
-        <w:t xml:space="preserve">is 10% vs. GPT-4o-mini’s 80–100%. This does not block the routing system (routing decisions are made by Presidio/regex on known labels, not by the LLM), but it means downstream extraction quality for locally-routed records will degrade measurably. The benchmark will report this degradation explicitly across PII groups.</w:t>
+        <w:t xml:space="preserve">Op1</w:t>
+      </w:r>
+      <w:r>
+        <w:rPr>
+          <w:b/>
+          <w:bCs/>
+        </w:rPr>
+        <w:t xml:space="preserve"> </w:t>
+      </w:r>
+      <w:r>
+        <w:rPr>
+          <w:rStyle w:val="VerbatimChar"/>
+          <w:b/>
+          <w:bCs/>
+        </w:rPr>
+        <w:t xml:space="preserve">sem_map</w:t>
+      </w:r>
+      <w:r>
+        <w:t xml:space="preserve"> </w:t>
+      </w:r>
+      <w:r>
+        <w:rPr>
+          <w:rStyle w:val="VerbatimChar"/>
+        </w:rPr>
+        <w:t xml:space="preserve">depends_on=["text","ssn","phone","name"]</w:t>
+      </w:r>
+      <w:r>
+        <w:t xml:space="preserve"> </w:t>
+      </w:r>
+      <w:r>
+        <w:t xml:space="preserve">— reads raw resume text and extracts a PII-free</w:t>
+      </w:r>
+      <w:r>
+        <w:t xml:space="preserve"> </w:t>
+      </w:r>
+      <w:r>
+        <w:rPr>
+          <w:rStyle w:val="VerbatimChar"/>
+        </w:rPr>
+        <w:t xml:space="preserve">skills_summary</w:t>
       </w:r>
     </w:p>
     <w:p>
@@ -2299,25 +2317,326 @@
           <w:b/>
           <w:bCs/>
         </w:rPr>
-        <w:t xml:space="preserve">Presidio false-positive rate on resumes.</w:t>
-      </w:r>
-      <w:r>
-        <w:t xml:space="preserve"> </w:t>
-      </w:r>
-      <w:r>
-        <w:t xml:space="preserve">Resume text contains names and dates that are not PII in context (section headers misidentified as names, year ranges matching phone patterns). Mitigation: tune</w:t>
-      </w:r>
-      <w:r>
-        <w:t xml:space="preserve"> </w:t>
-      </w:r>
-      <w:r>
-        <w:rPr>
-          <w:rStyle w:val="VerbatimChar"/>
-        </w:rPr>
-        <w:t xml:space="preserve">score_threshold</w:t>
-      </w:r>
-      <w:r>
-        <w:t xml:space="preserve">; consider disabling the</w:t>
+        <w:t xml:space="preserve">Op2</w:t>
+      </w:r>
+      <w:r>
+        <w:rPr>
+          <w:b/>
+          <w:bCs/>
+        </w:rPr>
+        <w:t xml:space="preserve"> </w:t>
+      </w:r>
+      <w:r>
+        <w:rPr>
+          <w:rStyle w:val="VerbatimChar"/>
+          <w:b/>
+          <w:bCs/>
+        </w:rPr>
+        <w:t xml:space="preserve">sem_filter</w:t>
+      </w:r>
+      <w:r>
+        <w:t xml:space="preserve"> </w:t>
+      </w:r>
+      <w:r>
+        <w:rPr>
+          <w:rStyle w:val="VerbatimChar"/>
+        </w:rPr>
+        <w:t xml:space="preserve">depends_on=["skills_summary"]</w:t>
+      </w:r>
+      <w:r>
+        <w:t xml:space="preserve"> </w:t>
+      </w:r>
+      <w:r>
+        <w:t xml:space="preserve">— filters on the derived field only</w:t>
+      </w:r>
+    </w:p>
+    <w:p>
+      <w:pPr>
+        <w:pStyle w:val="FirstParagraph"/>
+      </w:pPr>
+      <w:r>
+        <w:t xml:space="preserve">Op2 should</w:t>
+      </w:r>
+      <w:r>
+        <w:t xml:space="preserve"> </w:t>
+      </w:r>
+      <w:r>
+        <w:rPr>
+          <w:b/>
+          <w:bCs/>
+        </w:rPr>
+        <w:t xml:space="preserve">always</w:t>
+      </w:r>
+      <w:r>
+        <w:t xml:space="preserve"> </w:t>
+      </w:r>
+      <w:r>
+        <w:t xml:space="preserve">route to cloud:</w:t>
+      </w:r>
+      <w:r>
+        <w:t xml:space="preserve"> </w:t>
+      </w:r>
+      <w:r>
+        <w:rPr>
+          <w:rStyle w:val="VerbatimChar"/>
+        </w:rPr>
+        <w:t xml:space="preserve">skills_summary</w:t>
+      </w:r>
+      <w:r>
+        <w:t xml:space="preserve"> </w:t>
+      </w:r>
+      <w:r>
+        <w:t xml:space="preserve">contains no raw PII. Over-routing Op2 to local wastes quality with no privacy benefit.</w:t>
+      </w:r>
+    </w:p>
+    <w:tbl>
+      <w:tblPr>
+        <w:tblStyle w:val="Table"/>
+        <w:tblW w:type="auto" w:w="0"/>
+        <w:tblLook w:firstRow="1" w:lastRow="0" w:firstColumn="0" w:lastColumn="0" w:noHBand="0" w:noVBand="0" w:val="0020"/>
+      </w:tblPr>
+      <w:tblGrid>
+        <w:gridCol w:w="1980"/>
+        <w:gridCol w:w="1980"/>
+        <w:gridCol w:w="1980"/>
+        <w:gridCol w:w="1980"/>
+      </w:tblGrid>
+      <w:tr>
+        <w:trPr>
+          <w:tblHeader w:val="on"/>
+        </w:trPr>
+        <w:tc>
+          <w:tcPr/>
+          <w:p>
+            <w:pPr>
+              <w:pStyle w:val="Compact"/>
+            </w:pPr>
+            <w:r>
+              <w:t xml:space="preserve">Granularity</w:t>
+            </w:r>
+          </w:p>
+        </w:tc>
+        <w:tc>
+          <w:tcPr/>
+          <w:p>
+            <w:pPr>
+              <w:pStyle w:val="Compact"/>
+            </w:pPr>
+            <w:r>
+              <w:t xml:space="preserve">Op1 Recall</w:t>
+            </w:r>
+          </w:p>
+        </w:tc>
+        <w:tc>
+          <w:tcPr/>
+          <w:p>
+            <w:pPr>
+              <w:pStyle w:val="Compact"/>
+            </w:pPr>
+            <w:r>
+              <w:t xml:space="preserve">Op2 Over-Route</w:t>
+            </w:r>
+          </w:p>
+        </w:tc>
+        <w:tc>
+          <w:tcPr/>
+          <w:p>
+            <w:pPr>
+              <w:pStyle w:val="Compact"/>
+            </w:pPr>
+            <w:r>
+              <w:t xml:space="preserve">Op2 Correct</w:t>
+            </w:r>
+          </w:p>
+        </w:tc>
+      </w:tr>
+      <w:tr>
+        <w:tc>
+          <w:tcPr/>
+          <w:p>
+            <w:pPr>
+              <w:pStyle w:val="Compact"/>
+            </w:pPr>
+            <w:r>
+              <w:rPr>
+                <w:b/>
+                <w:bCs/>
+              </w:rPr>
+              <w:t xml:space="preserve">OPERATOR</w:t>
+            </w:r>
+          </w:p>
+        </w:tc>
+        <w:tc>
+          <w:tcPr/>
+          <w:p>
+            <w:pPr>
+              <w:pStyle w:val="Compact"/>
+            </w:pPr>
+            <w:r>
+              <w:rPr>
+                <w:b/>
+                <w:bCs/>
+              </w:rPr>
+              <w:t xml:space="preserve">98.8%</w:t>
+            </w:r>
+          </w:p>
+        </w:tc>
+        <w:tc>
+          <w:tcPr/>
+          <w:p>
+            <w:pPr>
+              <w:pStyle w:val="Compact"/>
+            </w:pPr>
+            <w:r>
+              <w:rPr>
+                <w:b/>
+                <w:bCs/>
+              </w:rPr>
+              <w:t xml:space="preserve">0%</w:t>
+            </w:r>
+          </w:p>
+        </w:tc>
+        <w:tc>
+          <w:tcPr/>
+          <w:p>
+            <w:pPr>
+              <w:pStyle w:val="Compact"/>
+            </w:pPr>
+            <w:r>
+              <w:rPr>
+                <w:b/>
+                <w:bCs/>
+              </w:rPr>
+              <w:t xml:space="preserve">100%</w:t>
+            </w:r>
+          </w:p>
+        </w:tc>
+      </w:tr>
+      <w:tr>
+        <w:tc>
+          <w:tcPr/>
+          <w:p>
+            <w:pPr>
+              <w:pStyle w:val="Compact"/>
+            </w:pPr>
+            <w:r>
+              <w:t xml:space="preserve">FIELD</w:t>
+            </w:r>
+          </w:p>
+        </w:tc>
+        <w:tc>
+          <w:tcPr/>
+          <w:p>
+            <w:pPr>
+              <w:pStyle w:val="Compact"/>
+            </w:pPr>
+            <w:r>
+              <w:t xml:space="preserve">98.8%</w:t>
+            </w:r>
+          </w:p>
+        </w:tc>
+        <w:tc>
+          <w:tcPr/>
+          <w:p>
+            <w:pPr>
+              <w:pStyle w:val="Compact"/>
+            </w:pPr>
+            <w:r>
+              <w:t xml:space="preserve">53.2%</w:t>
+            </w:r>
+          </w:p>
+        </w:tc>
+        <w:tc>
+          <w:tcPr/>
+          <w:p>
+            <w:pPr>
+              <w:pStyle w:val="Compact"/>
+            </w:pPr>
+            <w:r>
+              <w:t xml:space="preserve">46.8%</w:t>
+            </w:r>
+          </w:p>
+        </w:tc>
+      </w:tr>
+      <w:tr>
+        <w:tc>
+          <w:tcPr/>
+          <w:p>
+            <w:pPr>
+              <w:pStyle w:val="Compact"/>
+            </w:pPr>
+            <w:r>
+              <w:t xml:space="preserve">DOCUMENT</w:t>
+            </w:r>
+          </w:p>
+        </w:tc>
+        <w:tc>
+          <w:tcPr/>
+          <w:p>
+            <w:pPr>
+              <w:pStyle w:val="Compact"/>
+            </w:pPr>
+            <w:r>
+              <w:t xml:space="preserve">98.8%</w:t>
+            </w:r>
+          </w:p>
+        </w:tc>
+        <w:tc>
+          <w:tcPr/>
+          <w:p>
+            <w:pPr>
+              <w:pStyle w:val="Compact"/>
+            </w:pPr>
+            <w:r>
+              <w:t xml:space="preserve">53.2%</w:t>
+            </w:r>
+          </w:p>
+        </w:tc>
+        <w:tc>
+          <w:tcPr/>
+          <w:p>
+            <w:pPr>
+              <w:pStyle w:val="Compact"/>
+            </w:pPr>
+            <w:r>
+              <w:t xml:space="preserve">46.8%</w:t>
+            </w:r>
+          </w:p>
+        </w:tc>
+      </w:tr>
+    </w:tbl>
+    <w:p>
+      <w:pPr>
+        <w:pStyle w:val="BodyText"/>
+      </w:pPr>
+      <w:r>
+        <w:rPr>
+          <w:b/>
+          <w:bCs/>
+        </w:rPr>
+        <w:t xml:space="preserve">OPERATOR-level routing is the clear winner.</w:t>
+      </w:r>
+      <w:r>
+        <w:t xml:space="preserve"> </w:t>
+      </w:r>
+      <w:r>
+        <w:t xml:space="preserve">It achieves the same Op1 privacy recall (98.8%) as the other granularities while routing zero Op2 calls to local unnecessarily. FIELD and DOCUMENT both over-route 53% of Op2 calls to the local model despite Op2 never reading a PII field.</w:t>
+      </w:r>
+    </w:p>
+    <w:p>
+      <w:pPr>
+        <w:pStyle w:val="BodyText"/>
+      </w:pPr>
+      <w:r>
+        <w:t xml:space="preserve">FIELD and DOCUMENT produce identical routing decisions on this dataset because the underlying field values are the same at scan time. They differ in computational cost (DOCUMENT is ~2.2× faster: 105s vs 229s) and would diverge on pipelines with in-place anonymization between operators — if Op1 anonymizes a field before Op2 runs, DOCUMENT would still route Op2 based on the original dirty field while FIELD would see the cleaned version.</w:t>
+      </w:r>
+    </w:p>
+    <w:p>
+      <w:pPr>
+        <w:pStyle w:val="BodyText"/>
+      </w:pPr>
+      <w:r>
+        <w:t xml:space="preserve">The 6 records missed at Op1 (FN, privacy risk) have weak PII signals — phone numbers that don’t match the regex and names that Presidio’s</w:t>
       </w:r>
       <w:r>
         <w:t xml:space="preserve"> </w:t>
@@ -2332,7 +2651,69 @@
         <w:t xml:space="preserve"> </w:t>
       </w:r>
       <w:r>
-        <w:t xml:space="preserve">detector in favor of structural PII types (SSN, phone, email) for routing decisions.</w:t>
+        <w:t xml:space="preserve">detector misses at</w:t>
+      </w:r>
+      <w:r>
+        <w:t xml:space="preserve"> </w:t>
+      </w:r>
+      <w:r>
+        <w:rPr>
+          <w:rStyle w:val="VerbatimChar"/>
+        </w:rPr>
+        <w:t xml:space="preserve">score_threshold=0.6</w:t>
+      </w:r>
+      <w:r>
+        <w:t xml:space="preserve">. These are the same records flagged in Section 3.2 as difficult for GPT-4o-mini as well.</w:t>
+      </w:r>
+    </w:p>
+    <w:p>
+      <w:pPr>
+        <w:pStyle w:val="BodyText"/>
+      </w:pPr>
+      <w:r>
+        <w:t xml:space="preserve">Results saved to</w:t>
+      </w:r>
+      <w:r>
+        <w:t xml:space="preserve"> </w:t>
+      </w:r>
+      <w:r>
+        <w:rPr>
+          <w:rStyle w:val="VerbatimChar"/>
+        </w:rPr>
+        <w:t xml:space="preserve">data/q1_multi_1000.json</w:t>
+      </w:r>
+      <w:r>
+        <w:t xml:space="preserve">. Benchmark script:</w:t>
+      </w:r>
+      <w:r>
+        <w:t xml:space="preserve"> </w:t>
+      </w:r>
+      <w:r>
+        <w:rPr>
+          <w:rStyle w:val="VerbatimChar"/>
+        </w:rPr>
+        <w:t xml:space="preserve">demos/benchmark_q1.py --pipeline multi --sample 250</w:t>
+      </w:r>
+      <w:r>
+        <w:t xml:space="preserve">.</w:t>
+      </w:r>
+    </w:p>
+    <w:p>
+      <w:r>
+        <w:pict>
+          <v:rect style="width:0;height:1.5pt" o:hralign="center" o:hrstd="t" o:hr="t"/>
+        </w:pict>
+      </w:r>
+    </w:p>
+    <w:bookmarkEnd w:id="18"/>
+    <w:bookmarkEnd w:id="19"/>
+    <w:bookmarkStart w:id="20" w:name="potential-problems-and-mitigations"/>
+    <w:p>
+      <w:pPr>
+        <w:pStyle w:val="Heading2"/>
+      </w:pPr>
+      <w:r>
+        <w:t xml:space="preserve">4. Potential Problems and Mitigations</w:t>
       </w:r>
     </w:p>
     <w:p>
@@ -2340,7 +2721,7 @@
         <w:pStyle w:val="Compact"/>
         <w:numPr>
           <w:ilvl w:val="0"/>
-          <w:numId w:val="1006"/>
+          <w:numId w:val="1007"/>
         </w:numPr>
       </w:pPr>
       <w:r>
@@ -2348,28 +2729,28 @@
           <w:b/>
           <w:bCs/>
         </w:rPr>
-        <w:t xml:space="preserve">Data pipeline artifacts.</w:t>
-      </w:r>
-      <w:r>
-        <w:t xml:space="preserve"> </w:t>
-      </w:r>
-      <w:r>
-        <w:t xml:space="preserve">Two of three GPT-4o-mini false positives trace to the data pipeline (garbled</w:t>
-      </w:r>
-      <w:r>
-        <w:t xml:space="preserve"> </w:t>
-      </w:r>
-      <w:r>
-        <w:rPr>
-          <w:rStyle w:val="VerbatimChar"/>
-        </w:rPr>
-        <w:t xml:space="preserve">minimal</w:t>
-      </w:r>
-      <w:r>
-        <w:t xml:space="preserve"> </w:t>
-      </w:r>
-      <w:r>
-        <w:t xml:space="preserve">template rendering, third-party resume watermarks) rather than the model. We will flag these records in the ground-truth labels and exclude them from precision/recall computation, or fix the pipeline and re-run.</w:t>
+        <w:t xml:space="preserve">Local model quality gap is empirically confirmed.</w:t>
+      </w:r>
+      <w:r>
+        <w:t xml:space="preserve"> </w:t>
+      </w:r>
+      <w:r>
+        <w:t xml:space="preserve">llama3.2 recall on</w:t>
+      </w:r>
+      <w:r>
+        <w:t xml:space="preserve"> </w:t>
+      </w:r>
+      <w:r>
+        <w:rPr>
+          <w:rStyle w:val="VerbatimChar"/>
+        </w:rPr>
+        <w:t xml:space="preserve">sem_filter</w:t>
+      </w:r>
+      <w:r>
+        <w:t xml:space="preserve"> </w:t>
+      </w:r>
+      <w:r>
+        <w:t xml:space="preserve">is 10% vs. GPT-4o-mini’s 80–100%. This does not block the routing system (routing decisions are made by Presidio/regex on known labels, not by the LLM), but it means downstream extraction quality for locally-routed records will degrade measurably. The benchmark will report this degradation explicitly across PII groups.</w:t>
       </w:r>
     </w:p>
     <w:p>
@@ -2377,7 +2758,93 @@
         <w:pStyle w:val="Compact"/>
         <w:numPr>
           <w:ilvl w:val="0"/>
-          <w:numId w:val="1006"/>
+          <w:numId w:val="1007"/>
+        </w:numPr>
+      </w:pPr>
+      <w:r>
+        <w:rPr>
+          <w:b/>
+          <w:bCs/>
+        </w:rPr>
+        <w:t xml:space="preserve">Presidio false-positive rate on resumes.</w:t>
+      </w:r>
+      <w:r>
+        <w:t xml:space="preserve"> </w:t>
+      </w:r>
+      <w:r>
+        <w:t xml:space="preserve">Resume text contains names and dates that are not PII in context (section headers misidentified as names, year ranges matching phone patterns). Mitigation: tune</w:t>
+      </w:r>
+      <w:r>
+        <w:t xml:space="preserve"> </w:t>
+      </w:r>
+      <w:r>
+        <w:rPr>
+          <w:rStyle w:val="VerbatimChar"/>
+        </w:rPr>
+        <w:t xml:space="preserve">score_threshold</w:t>
+      </w:r>
+      <w:r>
+        <w:t xml:space="preserve">; consider disabling the</w:t>
+      </w:r>
+      <w:r>
+        <w:t xml:space="preserve"> </w:t>
+      </w:r>
+      <w:r>
+        <w:rPr>
+          <w:rStyle w:val="VerbatimChar"/>
+        </w:rPr>
+        <w:t xml:space="preserve">PERSON</w:t>
+      </w:r>
+      <w:r>
+        <w:t xml:space="preserve"> </w:t>
+      </w:r>
+      <w:r>
+        <w:t xml:space="preserve">detector in favor of structural PII types (SSN, phone, email) for routing decisions.</w:t>
+      </w:r>
+    </w:p>
+    <w:p>
+      <w:pPr>
+        <w:pStyle w:val="Compact"/>
+        <w:numPr>
+          <w:ilvl w:val="0"/>
+          <w:numId w:val="1007"/>
+        </w:numPr>
+      </w:pPr>
+      <w:r>
+        <w:rPr>
+          <w:b/>
+          <w:bCs/>
+        </w:rPr>
+        <w:t xml:space="preserve">Data pipeline artifacts.</w:t>
+      </w:r>
+      <w:r>
+        <w:t xml:space="preserve"> </w:t>
+      </w:r>
+      <w:r>
+        <w:t xml:space="preserve">Two of three GPT-4o-mini false positives trace to the data pipeline (garbled</w:t>
+      </w:r>
+      <w:r>
+        <w:t xml:space="preserve"> </w:t>
+      </w:r>
+      <w:r>
+        <w:rPr>
+          <w:rStyle w:val="VerbatimChar"/>
+        </w:rPr>
+        <w:t xml:space="preserve">minimal</w:t>
+      </w:r>
+      <w:r>
+        <w:t xml:space="preserve"> </w:t>
+      </w:r>
+      <w:r>
+        <w:t xml:space="preserve">template rendering, third-party resume watermarks) rather than the model. We will flag these records in the ground-truth labels and exclude them from precision/recall computation, or fix the pipeline and re-run.</w:t>
+      </w:r>
+    </w:p>
+    <w:p>
+      <w:pPr>
+        <w:pStyle w:val="Compact"/>
+        <w:numPr>
+          <w:ilvl w:val="0"/>
+          <w:numId w:val="1007"/>
         </w:numPr>
       </w:pPr>
       <w:r>
@@ -2416,8 +2883,8 @@
         </w:pict>
       </w:r>
     </w:p>
-    <w:bookmarkEnd w:id="19"/>
-    <w:bookmarkStart w:id="20" w:name="updated-timeline"/>
+    <w:bookmarkEnd w:id="20"/>
+    <w:bookmarkStart w:id="21" w:name="updated-timeline"/>
     <w:p>
       <w:pPr>
         <w:pStyle w:val="Heading2"/>
@@ -2730,7 +3197,7 @@
               <w:pStyle w:val="Compact"/>
             </w:pPr>
             <w:r>
-              <w:t xml:space="preserve">Full routing benchmark (Q1): three conditions × three granularities; PII detector comparison (Q2); query-intent routing pilot (Q3)</w:t>
+              <w:t xml:space="preserve">Q1 routing granularity benchmark complete (1,000 records); PII detector comparison (Q2); query-intent routing pilot (Q3)</w:t>
             </w:r>
           </w:p>
         </w:tc>
@@ -2778,8 +3245,8 @@
         </w:pict>
       </w:r>
     </w:p>
-    <w:bookmarkEnd w:id="20"/>
-    <w:bookmarkStart w:id="21" w:name="individual-contributions"/>
+    <w:bookmarkEnd w:id="21"/>
+    <w:bookmarkStart w:id="22" w:name="individual-contributions"/>
     <w:p>
       <w:pPr>
         <w:pStyle w:val="Heading2"/>
@@ -2941,7 +3408,16 @@
         <w:t xml:space="preserve"> </w:t>
       </w:r>
       <w:r>
-        <w:t xml:space="preserve">- Will lead Q1 benchmarks (routing granularity comparison) in week 11.</w:t>
+        <w:t xml:space="preserve">- Q1 routing granularity benchmark (</w:t>
+      </w:r>
+      <w:r>
+        <w:rPr>
+          <w:rStyle w:val="VerbatimChar"/>
+        </w:rPr>
+        <w:t xml:space="preserve">demos/benchmark_q1.py</w:t>
+      </w:r>
+      <w:r>
+        <w:t xml:space="preserve">): 1,000-record dry-run showing OPERATOR granularity achieves 98.8% recall with 0% over-routing vs 53% over-routing for FIELD/DOCUMENT.</w:t>
       </w:r>
     </w:p>
     <w:p>
@@ -3137,8 +3613,8 @@
         </w:pict>
       </w:r>
     </w:p>
-    <w:bookmarkEnd w:id="21"/>
-    <w:bookmarkStart w:id="22" w:name="questions-for-feedback"/>
+    <w:bookmarkEnd w:id="22"/>
+    <w:bookmarkStart w:id="23" w:name="questions-for-feedback"/>
     <w:p>
       <w:pPr>
         <w:pStyle w:val="Heading2"/>
@@ -3152,7 +3628,7 @@
         <w:pStyle w:val="Compact"/>
         <w:numPr>
           <w:ilvl w:val="0"/>
-          <w:numId w:val="1007"/>
+          <w:numId w:val="1008"/>
         </w:numPr>
       </w:pPr>
       <w:r>
@@ -3189,7 +3665,7 @@
         <w:pStyle w:val="Compact"/>
         <w:numPr>
           <w:ilvl w:val="0"/>
-          <w:numId w:val="1007"/>
+          <w:numId w:val="1008"/>
         </w:numPr>
       </w:pPr>
       <w:r>
@@ -3223,7 +3699,7 @@
         <w:pStyle w:val="Compact"/>
         <w:numPr>
           <w:ilvl w:val="0"/>
-          <w:numId w:val="1007"/>
+          <w:numId w:val="1008"/>
         </w:numPr>
       </w:pPr>
       <w:r>
@@ -3299,7 +3775,7 @@
         <w:pStyle w:val="Compact"/>
         <w:numPr>
           <w:ilvl w:val="0"/>
-          <w:numId w:val="1007"/>
+          <w:numId w:val="1008"/>
         </w:numPr>
       </w:pPr>
       <w:r>
@@ -3316,8 +3792,8 @@
         <w:t xml:space="preserve">Two of three GPT-4o-mini false positives trace to the data pipeline rather than the model. Should we fix the pipeline and re-run the baseline, or exclude these records from evaluation metrics and report the artifact rate separately?</w:t>
       </w:r>
     </w:p>
-    <w:bookmarkEnd w:id="22"/>
     <w:bookmarkEnd w:id="23"/>
+    <w:bookmarkEnd w:id="24"/>
     <w:sectPr>
       <w:footnotePr>
         <w:numRestart w:val="eachSect"/>
@@ -3665,6 +4141,9 @@
     <w:abstractNumId w:val="991"/>
   </w:num>
   <w:num w:numId="1007">
+    <w:abstractNumId w:val="991"/>
+  </w:num>
+  <w:num w:numId="1008">
     <w:abstractNumId w:val="991"/>
   </w:num>
 </w:numbering>

</xml_diff>